<commit_message>
Implementacion del diseño del modulo usuario y login
</commit_message>
<xml_diff>
--- a/Biblioteca/Documentacion/Corte II/Taller semana #10.docx
+++ b/Biblioteca/Documentacion/Corte II/Taller semana #10.docx
@@ -1,6 +1,6 @@
 
 <file path=word/document.xml><?xml version="1.0" encoding="utf-8"?>
-<w:document xmlns:wpc="http://schemas.microsoft.com/office/word/2010/wordprocessingCanvas" xmlns:cx="http://schemas.microsoft.com/office/drawing/2014/chartex" xmlns:cx1="http://schemas.microsoft.com/office/drawing/2015/9/8/chartex" xmlns:cx2="http://schemas.microsoft.com/office/drawing/2015/10/21/chartex" xmlns:cx3="http://schemas.microsoft.com/office/drawing/2016/5/9/chartex" xmlns:cx4="http://schemas.microsoft.com/office/drawing/2016/5/10/chartex" xmlns:cx5="http://schemas.microsoft.com/office/drawing/2016/5/11/chartex" xmlns:cx6="http://schemas.microsoft.com/office/drawing/2016/5/12/chartex" xmlns:cx7="http://schemas.microsoft.com/office/drawing/2016/5/13/chartex" xmlns:cx8="http://schemas.microsoft.com/office/drawing/2016/5/14/chartex" xmlns:mc="http://schemas.openxmlformats.org/markup-compatibility/2006" xmlns:aink="http://schemas.microsoft.com/office/drawing/2016/ink" xmlns:am3d="http://schemas.microsoft.com/office/drawing/2017/model3d" xmlns:o="urn:schemas-microsoft-com:office:office" xmlns:oel="http://schemas.microsoft.com/office/2019/extlst" xmlns:r="http://schemas.openxmlformats.org/officeDocument/2006/relationships" xmlns:m="http://schemas.openxmlformats.org/officeDocument/2006/math" xmlns:v="urn:schemas-microsoft-com:vml" xmlns:wp14="http://schemas.microsoft.com/office/word/2010/wordprocessingDrawing" xmlns:wp="http://schemas.openxmlformats.org/drawingml/2006/wordprocessingDrawing" xmlns:w10="urn:schemas-microsoft-com:office:word" xmlns:w="http://schemas.openxmlformats.org/wordprocessingml/2006/main" xmlns:w14="http://schemas.microsoft.com/office/word/2010/wordml" xmlns:w15="http://schemas.microsoft.com/office/word/2012/wordml" xmlns:w16cex="http://schemas.microsoft.com/office/word/2018/wordml/cex" xmlns:w16cid="http://schemas.microsoft.com/office/word/2016/wordml/cid" xmlns:w16="http://schemas.microsoft.com/office/word/2018/wordml" xmlns:w16sdtdh="http://schemas.microsoft.com/office/word/2020/wordml/sdtdatahash" xmlns:w16se="http://schemas.microsoft.com/office/word/2015/wordml/symex" xmlns:wpg="http://schemas.microsoft.com/office/word/2010/wordprocessingGroup" xmlns:wpi="http://schemas.microsoft.com/office/word/2010/wordprocessingInk" xmlns:wne="http://schemas.microsoft.com/office/word/2006/wordml" xmlns:wps="http://schemas.microsoft.com/office/word/2010/wordprocessingShape" mc:Ignorable="w14 w15 w16se w16cid w16 w16cex w16sdtdh wp14">
+<w:document xmlns:wpc="http://schemas.microsoft.com/office/word/2010/wordprocessingCanvas" xmlns:cx="http://schemas.microsoft.com/office/drawing/2014/chartex" xmlns:cx1="http://schemas.microsoft.com/office/drawing/2015/9/8/chartex" xmlns:cx2="http://schemas.microsoft.com/office/drawing/2015/10/21/chartex" xmlns:cx3="http://schemas.microsoft.com/office/drawing/2016/5/9/chartex" xmlns:cx4="http://schemas.microsoft.com/office/drawing/2016/5/10/chartex" xmlns:cx5="http://schemas.microsoft.com/office/drawing/2016/5/11/chartex" xmlns:cx6="http://schemas.microsoft.com/office/drawing/2016/5/12/chartex" xmlns:cx7="http://schemas.microsoft.com/office/drawing/2016/5/13/chartex" xmlns:cx8="http://schemas.microsoft.com/office/drawing/2016/5/14/chartex" xmlns:mc="http://schemas.openxmlformats.org/markup-compatibility/2006" xmlns:aink="http://schemas.microsoft.com/office/drawing/2016/ink" xmlns:am3d="http://schemas.microsoft.com/office/drawing/2017/model3d" xmlns:o="urn:schemas-microsoft-com:office:office" xmlns:r="http://schemas.openxmlformats.org/officeDocument/2006/relationships" xmlns:m="http://schemas.openxmlformats.org/officeDocument/2006/math" xmlns:v="urn:schemas-microsoft-com:vml" xmlns:wp14="http://schemas.microsoft.com/office/word/2010/wordprocessingDrawing" xmlns:wp="http://schemas.openxmlformats.org/drawingml/2006/wordprocessingDrawing" xmlns:w10="urn:schemas-microsoft-com:office:word" xmlns:w="http://schemas.openxmlformats.org/wordprocessingml/2006/main" xmlns:w14="http://schemas.microsoft.com/office/word/2010/wordml" xmlns:w15="http://schemas.microsoft.com/office/word/2012/wordml" xmlns:w16cex="http://schemas.microsoft.com/office/word/2018/wordml/cex" xmlns:w16cid="http://schemas.microsoft.com/office/word/2016/wordml/cid" xmlns:w16="http://schemas.microsoft.com/office/word/2018/wordml" xmlns:w16sdtdh="http://schemas.microsoft.com/office/word/2020/wordml/sdtdatahash" xmlns:w16se="http://schemas.microsoft.com/office/word/2015/wordml/symex" xmlns:wpg="http://schemas.microsoft.com/office/word/2010/wordprocessingGroup" xmlns:wpi="http://schemas.microsoft.com/office/word/2010/wordprocessingInk" xmlns:wne="http://schemas.microsoft.com/office/word/2006/wordml" xmlns:wps="http://schemas.microsoft.com/office/word/2010/wordprocessingShape" mc:Ignorable="w14 w15 w16se w16cid w16 w16cex w16sdtdh wp14">
   <w:body>
     <w:p>
       <w:pPr>
@@ -2283,7 +2283,7 @@
                 <w:sz w:val="24"/>
                 <w:szCs w:val="24"/>
               </w:rPr>
-              <w:t>36</w:t>
+              <w:t>37</w:t>
             </w:r>
             <w:r>
               <w:rPr>
@@ -20035,7 +20035,7 @@
 </file>
 
 <file path=word/endnotes.xml><?xml version="1.0" encoding="utf-8"?>
-<w:endnotes xmlns:wpc="http://schemas.microsoft.com/office/word/2010/wordprocessingCanvas" xmlns:cx="http://schemas.microsoft.com/office/drawing/2014/chartex" xmlns:cx1="http://schemas.microsoft.com/office/drawing/2015/9/8/chartex" xmlns:cx2="http://schemas.microsoft.com/office/drawing/2015/10/21/chartex" xmlns:cx3="http://schemas.microsoft.com/office/drawing/2016/5/9/chartex" xmlns:cx4="http://schemas.microsoft.com/office/drawing/2016/5/10/chartex" xmlns:cx5="http://schemas.microsoft.com/office/drawing/2016/5/11/chartex" xmlns:cx6="http://schemas.microsoft.com/office/drawing/2016/5/12/chartex" xmlns:cx7="http://schemas.microsoft.com/office/drawing/2016/5/13/chartex" xmlns:cx8="http://schemas.microsoft.com/office/drawing/2016/5/14/chartex" xmlns:mc="http://schemas.openxmlformats.org/markup-compatibility/2006" xmlns:aink="http://schemas.microsoft.com/office/drawing/2016/ink" xmlns:am3d="http://schemas.microsoft.com/office/drawing/2017/model3d" xmlns:o="urn:schemas-microsoft-com:office:office" xmlns:oel="http://schemas.microsoft.com/office/2019/extlst" xmlns:r="http://schemas.openxmlformats.org/officeDocument/2006/relationships" xmlns:m="http://schemas.openxmlformats.org/officeDocument/2006/math" xmlns:v="urn:schemas-microsoft-com:vml" xmlns:wp14="http://schemas.microsoft.com/office/word/2010/wordprocessingDrawing" xmlns:wp="http://schemas.openxmlformats.org/drawingml/2006/wordprocessingDrawing" xmlns:w10="urn:schemas-microsoft-com:office:word" xmlns:w="http://schemas.openxmlformats.org/wordprocessingml/2006/main" xmlns:w14="http://schemas.microsoft.com/office/word/2010/wordml" xmlns:w15="http://schemas.microsoft.com/office/word/2012/wordml" xmlns:w16cex="http://schemas.microsoft.com/office/word/2018/wordml/cex" xmlns:w16cid="http://schemas.microsoft.com/office/word/2016/wordml/cid" xmlns:w16="http://schemas.microsoft.com/office/word/2018/wordml" xmlns:w16sdtdh="http://schemas.microsoft.com/office/word/2020/wordml/sdtdatahash" xmlns:w16se="http://schemas.microsoft.com/office/word/2015/wordml/symex" xmlns:wpg="http://schemas.microsoft.com/office/word/2010/wordprocessingGroup" xmlns:wpi="http://schemas.microsoft.com/office/word/2010/wordprocessingInk" xmlns:wne="http://schemas.microsoft.com/office/word/2006/wordml" xmlns:wps="http://schemas.microsoft.com/office/word/2010/wordprocessingShape" mc:Ignorable="w14 w15 w16se w16cid w16 w16cex w16sdtdh wp14">
+<w:endnotes xmlns:wpc="http://schemas.microsoft.com/office/word/2010/wordprocessingCanvas" xmlns:cx="http://schemas.microsoft.com/office/drawing/2014/chartex" xmlns:cx1="http://schemas.microsoft.com/office/drawing/2015/9/8/chartex" xmlns:cx2="http://schemas.microsoft.com/office/drawing/2015/10/21/chartex" xmlns:cx3="http://schemas.microsoft.com/office/drawing/2016/5/9/chartex" xmlns:cx4="http://schemas.microsoft.com/office/drawing/2016/5/10/chartex" xmlns:cx5="http://schemas.microsoft.com/office/drawing/2016/5/11/chartex" xmlns:cx6="http://schemas.microsoft.com/office/drawing/2016/5/12/chartex" xmlns:cx7="http://schemas.microsoft.com/office/drawing/2016/5/13/chartex" xmlns:cx8="http://schemas.microsoft.com/office/drawing/2016/5/14/chartex" xmlns:mc="http://schemas.openxmlformats.org/markup-compatibility/2006" xmlns:aink="http://schemas.microsoft.com/office/drawing/2016/ink" xmlns:am3d="http://schemas.microsoft.com/office/drawing/2017/model3d" xmlns:o="urn:schemas-microsoft-com:office:office" xmlns:r="http://schemas.openxmlformats.org/officeDocument/2006/relationships" xmlns:m="http://schemas.openxmlformats.org/officeDocument/2006/math" xmlns:v="urn:schemas-microsoft-com:vml" xmlns:wp14="http://schemas.microsoft.com/office/word/2010/wordprocessingDrawing" xmlns:wp="http://schemas.openxmlformats.org/drawingml/2006/wordprocessingDrawing" xmlns:w10="urn:schemas-microsoft-com:office:word" xmlns:w="http://schemas.openxmlformats.org/wordprocessingml/2006/main" xmlns:w14="http://schemas.microsoft.com/office/word/2010/wordml" xmlns:w15="http://schemas.microsoft.com/office/word/2012/wordml" xmlns:w16cex="http://schemas.microsoft.com/office/word/2018/wordml/cex" xmlns:w16cid="http://schemas.microsoft.com/office/word/2016/wordml/cid" xmlns:w16="http://schemas.microsoft.com/office/word/2018/wordml" xmlns:w16sdtdh="http://schemas.microsoft.com/office/word/2020/wordml/sdtdatahash" xmlns:w16se="http://schemas.microsoft.com/office/word/2015/wordml/symex" xmlns:wpg="http://schemas.microsoft.com/office/word/2010/wordprocessingGroup" xmlns:wpi="http://schemas.microsoft.com/office/word/2010/wordprocessingInk" xmlns:wne="http://schemas.microsoft.com/office/word/2006/wordml" xmlns:wps="http://schemas.microsoft.com/office/word/2010/wordprocessingShape" mc:Ignorable="w14 w15 w16se w16cid w16 w16cex w16sdtdh wp14">
   <w:endnote w:type="separator" w:id="-1">
     <w:p>
       <w:pPr>
@@ -20060,7 +20060,7 @@
 </file>
 
 <file path=word/footer1.xml><?xml version="1.0" encoding="utf-8"?>
-<w:ftr xmlns:wpc="http://schemas.microsoft.com/office/word/2010/wordprocessingCanvas" xmlns:cx="http://schemas.microsoft.com/office/drawing/2014/chartex" xmlns:cx1="http://schemas.microsoft.com/office/drawing/2015/9/8/chartex" xmlns:cx2="http://schemas.microsoft.com/office/drawing/2015/10/21/chartex" xmlns:cx3="http://schemas.microsoft.com/office/drawing/2016/5/9/chartex" xmlns:cx4="http://schemas.microsoft.com/office/drawing/2016/5/10/chartex" xmlns:cx5="http://schemas.microsoft.com/office/drawing/2016/5/11/chartex" xmlns:cx6="http://schemas.microsoft.com/office/drawing/2016/5/12/chartex" xmlns:cx7="http://schemas.microsoft.com/office/drawing/2016/5/13/chartex" xmlns:cx8="http://schemas.microsoft.com/office/drawing/2016/5/14/chartex" xmlns:mc="http://schemas.openxmlformats.org/markup-compatibility/2006" xmlns:aink="http://schemas.microsoft.com/office/drawing/2016/ink" xmlns:am3d="http://schemas.microsoft.com/office/drawing/2017/model3d" xmlns:o="urn:schemas-microsoft-com:office:office" xmlns:oel="http://schemas.microsoft.com/office/2019/extlst" xmlns:r="http://schemas.openxmlformats.org/officeDocument/2006/relationships" xmlns:m="http://schemas.openxmlformats.org/officeDocument/2006/math" xmlns:v="urn:schemas-microsoft-com:vml" xmlns:wp14="http://schemas.microsoft.com/office/word/2010/wordprocessingDrawing" xmlns:wp="http://schemas.openxmlformats.org/drawingml/2006/wordprocessingDrawing" xmlns:w10="urn:schemas-microsoft-com:office:word" xmlns:w="http://schemas.openxmlformats.org/wordprocessingml/2006/main" xmlns:w14="http://schemas.microsoft.com/office/word/2010/wordml" xmlns:w15="http://schemas.microsoft.com/office/word/2012/wordml" xmlns:w16cex="http://schemas.microsoft.com/office/word/2018/wordml/cex" xmlns:w16cid="http://schemas.microsoft.com/office/word/2016/wordml/cid" xmlns:w16="http://schemas.microsoft.com/office/word/2018/wordml" xmlns:w16sdtdh="http://schemas.microsoft.com/office/word/2020/wordml/sdtdatahash" xmlns:w16se="http://schemas.microsoft.com/office/word/2015/wordml/symex" xmlns:wpg="http://schemas.microsoft.com/office/word/2010/wordprocessingGroup" xmlns:wpi="http://schemas.microsoft.com/office/word/2010/wordprocessingInk" xmlns:wne="http://schemas.microsoft.com/office/word/2006/wordml" xmlns:wps="http://schemas.microsoft.com/office/word/2010/wordprocessingShape" mc:Ignorable="w14 w15 w16se w16cid w16 w16cex w16sdtdh wp14">
+<w:ftr xmlns:wpc="http://schemas.microsoft.com/office/word/2010/wordprocessingCanvas" xmlns:cx="http://schemas.microsoft.com/office/drawing/2014/chartex" xmlns:cx1="http://schemas.microsoft.com/office/drawing/2015/9/8/chartex" xmlns:cx2="http://schemas.microsoft.com/office/drawing/2015/10/21/chartex" xmlns:cx3="http://schemas.microsoft.com/office/drawing/2016/5/9/chartex" xmlns:cx4="http://schemas.microsoft.com/office/drawing/2016/5/10/chartex" xmlns:cx5="http://schemas.microsoft.com/office/drawing/2016/5/11/chartex" xmlns:cx6="http://schemas.microsoft.com/office/drawing/2016/5/12/chartex" xmlns:cx7="http://schemas.microsoft.com/office/drawing/2016/5/13/chartex" xmlns:cx8="http://schemas.microsoft.com/office/drawing/2016/5/14/chartex" xmlns:mc="http://schemas.openxmlformats.org/markup-compatibility/2006" xmlns:aink="http://schemas.microsoft.com/office/drawing/2016/ink" xmlns:am3d="http://schemas.microsoft.com/office/drawing/2017/model3d" xmlns:o="urn:schemas-microsoft-com:office:office" xmlns:r="http://schemas.openxmlformats.org/officeDocument/2006/relationships" xmlns:m="http://schemas.openxmlformats.org/officeDocument/2006/math" xmlns:v="urn:schemas-microsoft-com:vml" xmlns:wp14="http://schemas.microsoft.com/office/word/2010/wordprocessingDrawing" xmlns:wp="http://schemas.openxmlformats.org/drawingml/2006/wordprocessingDrawing" xmlns:w10="urn:schemas-microsoft-com:office:word" xmlns:w="http://schemas.openxmlformats.org/wordprocessingml/2006/main" xmlns:w14="http://schemas.microsoft.com/office/word/2010/wordml" xmlns:w15="http://schemas.microsoft.com/office/word/2012/wordml" xmlns:w16cex="http://schemas.microsoft.com/office/word/2018/wordml/cex" xmlns:w16cid="http://schemas.microsoft.com/office/word/2016/wordml/cid" xmlns:w16="http://schemas.microsoft.com/office/word/2018/wordml" xmlns:w16sdtdh="http://schemas.microsoft.com/office/word/2020/wordml/sdtdatahash" xmlns:w16se="http://schemas.microsoft.com/office/word/2015/wordml/symex" xmlns:wpg="http://schemas.microsoft.com/office/word/2010/wordprocessingGroup" xmlns:wpi="http://schemas.microsoft.com/office/word/2010/wordprocessingInk" xmlns:wne="http://schemas.microsoft.com/office/word/2006/wordml" xmlns:wps="http://schemas.microsoft.com/office/word/2010/wordprocessingShape" mc:Ignorable="w14 w15 w16se w16cid w16 w16cex w16sdtdh wp14">
   <w:p>
     <w:pPr>
       <w:pStyle w:val="Piedepgina"/>
@@ -20125,7 +20125,7 @@
             </wp:anchor>
           </w:drawing>
         </mc:Choice>
-        <mc:Fallback xmlns:w16sdtfl="http://schemas.microsoft.com/office/word/2024/wordml/sdtformatlock" xmlns:w16du="http://schemas.microsoft.com/office/word/2023/wordml/word16du">
+        <mc:Fallback xmlns:w16du="http://schemas.microsoft.com/office/word/2023/wordml/word16du" xmlns:w16sdtfl="http://schemas.microsoft.com/office/word/2024/wordml/sdtformatlock" xmlns:oel="http://schemas.microsoft.com/office/2019/extlst">
           <w:pict>
             <v:shapetype w14:anchorId="76370194" id="_x0000_t64" coordsize="21600,21600" o:spt="64" adj="2809,10800" path="m@28@0c@27@1@26@3@25@0l@21@4c@22@5@23@6@24@4xe">
               <v:formulas>
@@ -20190,7 +20190,7 @@
 </file>
 
 <file path=word/footnotes.xml><?xml version="1.0" encoding="utf-8"?>
-<w:footnotes xmlns:wpc="http://schemas.microsoft.com/office/word/2010/wordprocessingCanvas" xmlns:cx="http://schemas.microsoft.com/office/drawing/2014/chartex" xmlns:cx1="http://schemas.microsoft.com/office/drawing/2015/9/8/chartex" xmlns:cx2="http://schemas.microsoft.com/office/drawing/2015/10/21/chartex" xmlns:cx3="http://schemas.microsoft.com/office/drawing/2016/5/9/chartex" xmlns:cx4="http://schemas.microsoft.com/office/drawing/2016/5/10/chartex" xmlns:cx5="http://schemas.microsoft.com/office/drawing/2016/5/11/chartex" xmlns:cx6="http://schemas.microsoft.com/office/drawing/2016/5/12/chartex" xmlns:cx7="http://schemas.microsoft.com/office/drawing/2016/5/13/chartex" xmlns:cx8="http://schemas.microsoft.com/office/drawing/2016/5/14/chartex" xmlns:mc="http://schemas.openxmlformats.org/markup-compatibility/2006" xmlns:aink="http://schemas.microsoft.com/office/drawing/2016/ink" xmlns:am3d="http://schemas.microsoft.com/office/drawing/2017/model3d" xmlns:o="urn:schemas-microsoft-com:office:office" xmlns:oel="http://schemas.microsoft.com/office/2019/extlst" xmlns:r="http://schemas.openxmlformats.org/officeDocument/2006/relationships" xmlns:m="http://schemas.openxmlformats.org/officeDocument/2006/math" xmlns:v="urn:schemas-microsoft-com:vml" xmlns:wp14="http://schemas.microsoft.com/office/word/2010/wordprocessingDrawing" xmlns:wp="http://schemas.openxmlformats.org/drawingml/2006/wordprocessingDrawing" xmlns:w10="urn:schemas-microsoft-com:office:word" xmlns:w="http://schemas.openxmlformats.org/wordprocessingml/2006/main" xmlns:w14="http://schemas.microsoft.com/office/word/2010/wordml" xmlns:w15="http://schemas.microsoft.com/office/word/2012/wordml" xmlns:w16cex="http://schemas.microsoft.com/office/word/2018/wordml/cex" xmlns:w16cid="http://schemas.microsoft.com/office/word/2016/wordml/cid" xmlns:w16="http://schemas.microsoft.com/office/word/2018/wordml" xmlns:w16sdtdh="http://schemas.microsoft.com/office/word/2020/wordml/sdtdatahash" xmlns:w16se="http://schemas.microsoft.com/office/word/2015/wordml/symex" xmlns:wpg="http://schemas.microsoft.com/office/word/2010/wordprocessingGroup" xmlns:wpi="http://schemas.microsoft.com/office/word/2010/wordprocessingInk" xmlns:wne="http://schemas.microsoft.com/office/word/2006/wordml" xmlns:wps="http://schemas.microsoft.com/office/word/2010/wordprocessingShape" mc:Ignorable="w14 w15 w16se w16cid w16 w16cex w16sdtdh wp14">
+<w:footnotes xmlns:wpc="http://schemas.microsoft.com/office/word/2010/wordprocessingCanvas" xmlns:cx="http://schemas.microsoft.com/office/drawing/2014/chartex" xmlns:cx1="http://schemas.microsoft.com/office/drawing/2015/9/8/chartex" xmlns:cx2="http://schemas.microsoft.com/office/drawing/2015/10/21/chartex" xmlns:cx3="http://schemas.microsoft.com/office/drawing/2016/5/9/chartex" xmlns:cx4="http://schemas.microsoft.com/office/drawing/2016/5/10/chartex" xmlns:cx5="http://schemas.microsoft.com/office/drawing/2016/5/11/chartex" xmlns:cx6="http://schemas.microsoft.com/office/drawing/2016/5/12/chartex" xmlns:cx7="http://schemas.microsoft.com/office/drawing/2016/5/13/chartex" xmlns:cx8="http://schemas.microsoft.com/office/drawing/2016/5/14/chartex" xmlns:mc="http://schemas.openxmlformats.org/markup-compatibility/2006" xmlns:aink="http://schemas.microsoft.com/office/drawing/2016/ink" xmlns:am3d="http://schemas.microsoft.com/office/drawing/2017/model3d" xmlns:o="urn:schemas-microsoft-com:office:office" xmlns:r="http://schemas.openxmlformats.org/officeDocument/2006/relationships" xmlns:m="http://schemas.openxmlformats.org/officeDocument/2006/math" xmlns:v="urn:schemas-microsoft-com:vml" xmlns:wp14="http://schemas.microsoft.com/office/word/2010/wordprocessingDrawing" xmlns:wp="http://schemas.openxmlformats.org/drawingml/2006/wordprocessingDrawing" xmlns:w10="urn:schemas-microsoft-com:office:word" xmlns:w="http://schemas.openxmlformats.org/wordprocessingml/2006/main" xmlns:w14="http://schemas.microsoft.com/office/word/2010/wordml" xmlns:w15="http://schemas.microsoft.com/office/word/2012/wordml" xmlns:w16cex="http://schemas.microsoft.com/office/word/2018/wordml/cex" xmlns:w16cid="http://schemas.microsoft.com/office/word/2016/wordml/cid" xmlns:w16="http://schemas.microsoft.com/office/word/2018/wordml" xmlns:w16sdtdh="http://schemas.microsoft.com/office/word/2020/wordml/sdtdatahash" xmlns:w16se="http://schemas.microsoft.com/office/word/2015/wordml/symex" xmlns:wpg="http://schemas.microsoft.com/office/word/2010/wordprocessingGroup" xmlns:wpi="http://schemas.microsoft.com/office/word/2010/wordprocessingInk" xmlns:wne="http://schemas.microsoft.com/office/word/2006/wordml" xmlns:wps="http://schemas.microsoft.com/office/word/2010/wordprocessingShape" mc:Ignorable="w14 w15 w16se w16cid w16 w16cex w16sdtdh wp14">
   <w:footnote w:type="separator" w:id="-1">
     <w:p>
       <w:pPr>
@@ -20215,7 +20215,7 @@
 </file>
 
 <file path=word/header1.xml><?xml version="1.0" encoding="utf-8"?>
-<w:hdr xmlns:wpc="http://schemas.microsoft.com/office/word/2010/wordprocessingCanvas" xmlns:cx="http://schemas.microsoft.com/office/drawing/2014/chartex" xmlns:cx1="http://schemas.microsoft.com/office/drawing/2015/9/8/chartex" xmlns:cx2="http://schemas.microsoft.com/office/drawing/2015/10/21/chartex" xmlns:cx3="http://schemas.microsoft.com/office/drawing/2016/5/9/chartex" xmlns:cx4="http://schemas.microsoft.com/office/drawing/2016/5/10/chartex" xmlns:cx5="http://schemas.microsoft.com/office/drawing/2016/5/11/chartex" xmlns:cx6="http://schemas.microsoft.com/office/drawing/2016/5/12/chartex" xmlns:cx7="http://schemas.microsoft.com/office/drawing/2016/5/13/chartex" xmlns:cx8="http://schemas.microsoft.com/office/drawing/2016/5/14/chartex" xmlns:mc="http://schemas.openxmlformats.org/markup-compatibility/2006" xmlns:aink="http://schemas.microsoft.com/office/drawing/2016/ink" xmlns:am3d="http://schemas.microsoft.com/office/drawing/2017/model3d" xmlns:o="urn:schemas-microsoft-com:office:office" xmlns:oel="http://schemas.microsoft.com/office/2019/extlst" xmlns:r="http://schemas.openxmlformats.org/officeDocument/2006/relationships" xmlns:m="http://schemas.openxmlformats.org/officeDocument/2006/math" xmlns:v="urn:schemas-microsoft-com:vml" xmlns:wp14="http://schemas.microsoft.com/office/word/2010/wordprocessingDrawing" xmlns:wp="http://schemas.openxmlformats.org/drawingml/2006/wordprocessingDrawing" xmlns:w10="urn:schemas-microsoft-com:office:word" xmlns:w="http://schemas.openxmlformats.org/wordprocessingml/2006/main" xmlns:w14="http://schemas.microsoft.com/office/word/2010/wordml" xmlns:w15="http://schemas.microsoft.com/office/word/2012/wordml" xmlns:w16cex="http://schemas.microsoft.com/office/word/2018/wordml/cex" xmlns:w16cid="http://schemas.microsoft.com/office/word/2016/wordml/cid" xmlns:w16="http://schemas.microsoft.com/office/word/2018/wordml" xmlns:w16sdtdh="http://schemas.microsoft.com/office/word/2020/wordml/sdtdatahash" xmlns:w16se="http://schemas.microsoft.com/office/word/2015/wordml/symex" xmlns:wpg="http://schemas.microsoft.com/office/word/2010/wordprocessingGroup" xmlns:wpi="http://schemas.microsoft.com/office/word/2010/wordprocessingInk" xmlns:wne="http://schemas.microsoft.com/office/word/2006/wordml" xmlns:wps="http://schemas.microsoft.com/office/word/2010/wordprocessingShape" mc:Ignorable="w14 w15 w16se w16cid w16 w16cex w16sdtdh wp14">
+<w:hdr xmlns:wpc="http://schemas.microsoft.com/office/word/2010/wordprocessingCanvas" xmlns:cx="http://schemas.microsoft.com/office/drawing/2014/chartex" xmlns:cx1="http://schemas.microsoft.com/office/drawing/2015/9/8/chartex" xmlns:cx2="http://schemas.microsoft.com/office/drawing/2015/10/21/chartex" xmlns:cx3="http://schemas.microsoft.com/office/drawing/2016/5/9/chartex" xmlns:cx4="http://schemas.microsoft.com/office/drawing/2016/5/10/chartex" xmlns:cx5="http://schemas.microsoft.com/office/drawing/2016/5/11/chartex" xmlns:cx6="http://schemas.microsoft.com/office/drawing/2016/5/12/chartex" xmlns:cx7="http://schemas.microsoft.com/office/drawing/2016/5/13/chartex" xmlns:cx8="http://schemas.microsoft.com/office/drawing/2016/5/14/chartex" xmlns:mc="http://schemas.openxmlformats.org/markup-compatibility/2006" xmlns:aink="http://schemas.microsoft.com/office/drawing/2016/ink" xmlns:am3d="http://schemas.microsoft.com/office/drawing/2017/model3d" xmlns:o="urn:schemas-microsoft-com:office:office" xmlns:r="http://schemas.openxmlformats.org/officeDocument/2006/relationships" xmlns:m="http://schemas.openxmlformats.org/officeDocument/2006/math" xmlns:v="urn:schemas-microsoft-com:vml" xmlns:wp14="http://schemas.microsoft.com/office/word/2010/wordprocessingDrawing" xmlns:wp="http://schemas.openxmlformats.org/drawingml/2006/wordprocessingDrawing" xmlns:w10="urn:schemas-microsoft-com:office:word" xmlns:w="http://schemas.openxmlformats.org/wordprocessingml/2006/main" xmlns:w14="http://schemas.microsoft.com/office/word/2010/wordml" xmlns:w15="http://schemas.microsoft.com/office/word/2012/wordml" xmlns:w16cex="http://schemas.microsoft.com/office/word/2018/wordml/cex" xmlns:w16cid="http://schemas.microsoft.com/office/word/2016/wordml/cid" xmlns:w16="http://schemas.microsoft.com/office/word/2018/wordml" xmlns:w16sdtdh="http://schemas.microsoft.com/office/word/2020/wordml/sdtdatahash" xmlns:w16se="http://schemas.microsoft.com/office/word/2015/wordml/symex" xmlns:wpg="http://schemas.microsoft.com/office/word/2010/wordprocessingGroup" xmlns:wpi="http://schemas.microsoft.com/office/word/2010/wordprocessingInk" xmlns:wne="http://schemas.microsoft.com/office/word/2006/wordml" xmlns:wps="http://schemas.microsoft.com/office/word/2010/wordprocessingShape" mc:Ignorable="w14 w15 w16se w16cid w16 w16cex w16sdtdh wp14">
   <w:p>
     <w:pPr>
       <w:pStyle w:val="Encabezado"/>
@@ -20349,7 +20349,7 @@
             </wp:anchor>
           </w:drawing>
         </mc:Choice>
-        <mc:Fallback xmlns:w16sdtfl="http://schemas.microsoft.com/office/word/2024/wordml/sdtformatlock" xmlns:w16du="http://schemas.microsoft.com/office/word/2023/wordml/word16du">
+        <mc:Fallback xmlns:w16du="http://schemas.microsoft.com/office/word/2023/wordml/word16du" xmlns:w16sdtfl="http://schemas.microsoft.com/office/word/2024/wordml/sdtformatlock" xmlns:oel="http://schemas.microsoft.com/office/2019/extlst">
           <w:pict>
             <v:shapetype w14:anchorId="25B8E203" id="_x0000_t64" coordsize="21600,21600" o:spt="64" adj="2809,10800" path="m@28@0c@27@1@26@3@25@0l@21@4c@22@5@23@6@24@4xe">
               <v:formulas>
@@ -20414,7 +20414,7 @@
 </file>
 
 <file path=word/numbering.xml><?xml version="1.0" encoding="utf-8"?>
-<w:numbering xmlns:wpc="http://schemas.microsoft.com/office/word/2010/wordprocessingCanvas" xmlns:cx="http://schemas.microsoft.com/office/drawing/2014/chartex" xmlns:cx1="http://schemas.microsoft.com/office/drawing/2015/9/8/chartex" xmlns:cx2="http://schemas.microsoft.com/office/drawing/2015/10/21/chartex" xmlns:cx3="http://schemas.microsoft.com/office/drawing/2016/5/9/chartex" xmlns:cx4="http://schemas.microsoft.com/office/drawing/2016/5/10/chartex" xmlns:cx5="http://schemas.microsoft.com/office/drawing/2016/5/11/chartex" xmlns:cx6="http://schemas.microsoft.com/office/drawing/2016/5/12/chartex" xmlns:cx7="http://schemas.microsoft.com/office/drawing/2016/5/13/chartex" xmlns:cx8="http://schemas.microsoft.com/office/drawing/2016/5/14/chartex" xmlns:mc="http://schemas.openxmlformats.org/markup-compatibility/2006" xmlns:aink="http://schemas.microsoft.com/office/drawing/2016/ink" xmlns:am3d="http://schemas.microsoft.com/office/drawing/2017/model3d" xmlns:o="urn:schemas-microsoft-com:office:office" xmlns:oel="http://schemas.microsoft.com/office/2019/extlst" xmlns:r="http://schemas.openxmlformats.org/officeDocument/2006/relationships" xmlns:m="http://schemas.openxmlformats.org/officeDocument/2006/math" xmlns:v="urn:schemas-microsoft-com:vml" xmlns:wp14="http://schemas.microsoft.com/office/word/2010/wordprocessingDrawing" xmlns:wp="http://schemas.openxmlformats.org/drawingml/2006/wordprocessingDrawing" xmlns:w10="urn:schemas-microsoft-com:office:word" xmlns:w="http://schemas.openxmlformats.org/wordprocessingml/2006/main" xmlns:w14="http://schemas.microsoft.com/office/word/2010/wordml" xmlns:w15="http://schemas.microsoft.com/office/word/2012/wordml" xmlns:w16cex="http://schemas.microsoft.com/office/word/2018/wordml/cex" xmlns:w16cid="http://schemas.microsoft.com/office/word/2016/wordml/cid" xmlns:w16="http://schemas.microsoft.com/office/word/2018/wordml" xmlns:w16sdtdh="http://schemas.microsoft.com/office/word/2020/wordml/sdtdatahash" xmlns:w16se="http://schemas.microsoft.com/office/word/2015/wordml/symex" xmlns:wpg="http://schemas.microsoft.com/office/word/2010/wordprocessingGroup" xmlns:wpi="http://schemas.microsoft.com/office/word/2010/wordprocessingInk" xmlns:wne="http://schemas.microsoft.com/office/word/2006/wordml" xmlns:wps="http://schemas.microsoft.com/office/word/2010/wordprocessingShape" mc:Ignorable="w14 w15 w16se w16cid w16 w16cex w16sdtdh wp14">
+<w:numbering xmlns:wpc="http://schemas.microsoft.com/office/word/2010/wordprocessingCanvas" xmlns:cx="http://schemas.microsoft.com/office/drawing/2014/chartex" xmlns:cx1="http://schemas.microsoft.com/office/drawing/2015/9/8/chartex" xmlns:cx2="http://schemas.microsoft.com/office/drawing/2015/10/21/chartex" xmlns:cx3="http://schemas.microsoft.com/office/drawing/2016/5/9/chartex" xmlns:cx4="http://schemas.microsoft.com/office/drawing/2016/5/10/chartex" xmlns:cx5="http://schemas.microsoft.com/office/drawing/2016/5/11/chartex" xmlns:cx6="http://schemas.microsoft.com/office/drawing/2016/5/12/chartex" xmlns:cx7="http://schemas.microsoft.com/office/drawing/2016/5/13/chartex" xmlns:cx8="http://schemas.microsoft.com/office/drawing/2016/5/14/chartex" xmlns:mc="http://schemas.openxmlformats.org/markup-compatibility/2006" xmlns:aink="http://schemas.microsoft.com/office/drawing/2016/ink" xmlns:am3d="http://schemas.microsoft.com/office/drawing/2017/model3d" xmlns:o="urn:schemas-microsoft-com:office:office" xmlns:r="http://schemas.openxmlformats.org/officeDocument/2006/relationships" xmlns:m="http://schemas.openxmlformats.org/officeDocument/2006/math" xmlns:v="urn:schemas-microsoft-com:vml" xmlns:wp14="http://schemas.microsoft.com/office/word/2010/wordprocessingDrawing" xmlns:wp="http://schemas.openxmlformats.org/drawingml/2006/wordprocessingDrawing" xmlns:w10="urn:schemas-microsoft-com:office:word" xmlns:w="http://schemas.openxmlformats.org/wordprocessingml/2006/main" xmlns:w14="http://schemas.microsoft.com/office/word/2010/wordml" xmlns:w15="http://schemas.microsoft.com/office/word/2012/wordml" xmlns:w16cex="http://schemas.microsoft.com/office/word/2018/wordml/cex" xmlns:w16cid="http://schemas.microsoft.com/office/word/2016/wordml/cid" xmlns:w16="http://schemas.microsoft.com/office/word/2018/wordml" xmlns:w16sdtdh="http://schemas.microsoft.com/office/word/2020/wordml/sdtdatahash" xmlns:w16se="http://schemas.microsoft.com/office/word/2015/wordml/symex" xmlns:wpg="http://schemas.microsoft.com/office/word/2010/wordprocessingGroup" xmlns:wpi="http://schemas.microsoft.com/office/word/2010/wordprocessingInk" xmlns:wne="http://schemas.microsoft.com/office/word/2006/wordml" xmlns:wps="http://schemas.microsoft.com/office/word/2010/wordprocessingShape" mc:Ignorable="w14 w15 w16se w16cid w16 w16cex w16sdtdh wp14">
   <w:abstractNum w:abstractNumId="0" w15:restartNumberingAfterBreak="0">
     <w:nsid w:val="05831C0E"/>
     <w:multiLevelType w:val="multilevel"/>
@@ -23276,76 +23276,76 @@
       </w:rPr>
     </w:lvl>
   </w:abstractNum>
-  <w:num w:numId="1" w16cid:durableId="1360087644">
+  <w:num w:numId="1">
     <w:abstractNumId w:val="11"/>
   </w:num>
-  <w:num w:numId="2" w16cid:durableId="1694767671">
+  <w:num w:numId="2">
     <w:abstractNumId w:val="6"/>
   </w:num>
-  <w:num w:numId="3" w16cid:durableId="173033699">
+  <w:num w:numId="3">
     <w:abstractNumId w:val="13"/>
   </w:num>
-  <w:num w:numId="4" w16cid:durableId="1127772757">
+  <w:num w:numId="4">
     <w:abstractNumId w:val="12"/>
   </w:num>
-  <w:num w:numId="5" w16cid:durableId="1550069212">
+  <w:num w:numId="5">
     <w:abstractNumId w:val="10"/>
   </w:num>
-  <w:num w:numId="6" w16cid:durableId="1960136797">
+  <w:num w:numId="6">
     <w:abstractNumId w:val="15"/>
   </w:num>
-  <w:num w:numId="7" w16cid:durableId="929310995">
+  <w:num w:numId="7">
     <w:abstractNumId w:val="18"/>
   </w:num>
-  <w:num w:numId="8" w16cid:durableId="1793287333">
+  <w:num w:numId="8">
     <w:abstractNumId w:val="5"/>
   </w:num>
-  <w:num w:numId="9" w16cid:durableId="1627393637">
+  <w:num w:numId="9">
     <w:abstractNumId w:val="2"/>
   </w:num>
-  <w:num w:numId="10" w16cid:durableId="1104963875">
+  <w:num w:numId="10">
     <w:abstractNumId w:val="23"/>
   </w:num>
-  <w:num w:numId="11" w16cid:durableId="429276399">
+  <w:num w:numId="11">
     <w:abstractNumId w:val="9"/>
   </w:num>
-  <w:num w:numId="12" w16cid:durableId="1046024929">
+  <w:num w:numId="12">
     <w:abstractNumId w:val="14"/>
   </w:num>
-  <w:num w:numId="13" w16cid:durableId="1069378958">
+  <w:num w:numId="13">
     <w:abstractNumId w:val="3"/>
   </w:num>
-  <w:num w:numId="14" w16cid:durableId="753092982">
+  <w:num w:numId="14">
     <w:abstractNumId w:val="21"/>
   </w:num>
-  <w:num w:numId="15" w16cid:durableId="1785609515">
+  <w:num w:numId="15">
     <w:abstractNumId w:val="17"/>
   </w:num>
-  <w:num w:numId="16" w16cid:durableId="85856717">
+  <w:num w:numId="16">
     <w:abstractNumId w:val="19"/>
   </w:num>
-  <w:num w:numId="17" w16cid:durableId="348920588">
+  <w:num w:numId="17">
     <w:abstractNumId w:val="1"/>
   </w:num>
-  <w:num w:numId="18" w16cid:durableId="1276712081">
+  <w:num w:numId="18">
     <w:abstractNumId w:val="0"/>
   </w:num>
-  <w:num w:numId="19" w16cid:durableId="1331178001">
+  <w:num w:numId="19">
     <w:abstractNumId w:val="20"/>
   </w:num>
-  <w:num w:numId="20" w16cid:durableId="406808124">
+  <w:num w:numId="20">
     <w:abstractNumId w:val="4"/>
   </w:num>
-  <w:num w:numId="21" w16cid:durableId="1763799799">
+  <w:num w:numId="21">
     <w:abstractNumId w:val="7"/>
   </w:num>
-  <w:num w:numId="22" w16cid:durableId="331642968">
+  <w:num w:numId="22">
     <w:abstractNumId w:val="16"/>
   </w:num>
-  <w:num w:numId="23" w16cid:durableId="1140733413">
+  <w:num w:numId="23">
     <w:abstractNumId w:val="8"/>
   </w:num>
-  <w:num w:numId="24" w16cid:durableId="1377503851">
+  <w:num w:numId="24">
     <w:abstractNumId w:val="22"/>
   </w:num>
 </w:numbering>

</xml_diff>